<commit_message>
feat(grade9): add Lesson 19.5 Vibecoding E-Commerce Backend & Postman Studio
- Add complete 19.5-dars: Vibecoding E-Commerce Backend with Users and Orders
- Implement Express REST CRUD endpoints: GET/POST /api/users, GET/POST/PATCH/DELETE /api/orders
- Add interactive Postman Studio with in-browser request runner, test assertions (pm.test), and live SQLite table inspector
- Include standalone server.js, package.json, and Target_Ecommerce_API.postman_collection.json
- Include 12-slide presentation (prezentatsiya.html) and 2-page print worksheet (varaqa.html)
- Integrate 19.5-dars into index.html portal, REJA.md, reja.html, and official Word syllabus documents
</commit_message>
<xml_diff>
--- a/assets/ISH_REJASI_10_11_SINF.docx
+++ b/assets/ISH_REJASI_10_11_SINF.docx
@@ -3768,7 +3768,7 @@
                 <w:b/>
                 <w:sz w:val="15"/>
               </w:rPr>
-              <w:t>Kriptografiya Asoslari: AES, RSA va ECC</w:t>
+              <w:t>Kriptografiya Asoslari: AES-256, RSA va Maxfiy Aloqa</w:t>
             </w:r>
           </w:p>
         </w:tc>
@@ -3876,7 +3876,7 @@
                 <w:rFonts w:ascii="Arial" w:hAnsi="Arial"/>
                 <w:sz w:val="15"/>
               </w:rPr>
-              <w:t>Crypto Studio</w:t>
+              <w:t>Interaktiv Studio</w:t>
             </w:r>
           </w:p>
         </w:tc>
@@ -4057,7 +4057,7 @@
                 <w:rFonts w:ascii="Arial" w:hAnsi="Arial"/>
                 <w:sz w:val="15"/>
               </w:rPr>
-              <w:t>Zero Trust Studio</w:t>
+              <w:t>Interaktiv Studio</w:t>
             </w:r>
           </w:p>
         </w:tc>
@@ -4238,7 +4238,7 @@
                 <w:rFonts w:ascii="Arial" w:hAnsi="Arial"/>
                 <w:sz w:val="15"/>
               </w:rPr>
-              <w:t>API Defender Studio</w:t>
+              <w:t>Interaktiv Studio</w:t>
             </w:r>
           </w:p>
         </w:tc>
@@ -4419,7 +4419,7 @@
                 <w:rFonts w:ascii="Arial" w:hAnsi="Arial"/>
                 <w:sz w:val="15"/>
               </w:rPr>
-              <w:t>AI Red Teaming Studio</w:t>
+              <w:t>Interaktiv Studio</w:t>
             </w:r>
           </w:p>
         </w:tc>
@@ -4600,7 +4600,7 @@
                 <w:rFonts w:ascii="Arial" w:hAnsi="Arial"/>
                 <w:sz w:val="15"/>
               </w:rPr>
-              <w:t>SOC Dashboard Studio</w:t>
+              <w:t>Interaktiv Studio</w:t>
             </w:r>
           </w:p>
         </w:tc>

</xml_diff>

<commit_message>
feat(week7): complete Week 7 lessons for 5-6 and 7-8 grades
- Add 5-6-sinf Week 7 Lesson 21: Raqamli Iz (Digital Footprint) va Shaxsiy Maxfiylik (Target Privacy & Digital Footprint Studio, 12-slide presentation, 2-page worksheet, teacher guide)
- Add 7-8-sinf Week 7 Lesson 29: Taktika va O'yinchi AI: Taktik Sxemalar va Pozitsiya Algoritmi (FUT Tactical & Pitch AI Studio, 12-slide presentation, 2-page worksheet, teacher guide)
- Update build_portal.py with all week 7 metadata; compile 112 total lessons into index.html
- Update REJA.md, reja.html, and official Word (.docx) curriculum documents
- Verify 100% localization validation across all lesson files
</commit_message>
<xml_diff>
--- a/assets/ISH_REJASI_10_11_SINF.docx
+++ b/assets/ISH_REJASI_10_11_SINF.docx
@@ -199,7 +199,7 @@
           <w:color w:val="1E3A8A"/>
           <w:sz w:val="24"/>
         </w:rPr>
-        <w:t>Kohorta: 10–11-sinf: Senior AI &amp; Muhandislik (Senior Track) — Yillik Reja (36 Hafta / 178 Soat)</w:t>
+        <w:t>Kohorta: 10–11-sinf: Senior AI &amp; Muhandislik (Senior Track) — Yillik Reja (36 Hafta / 186 Soat)</w:t>
       </w:r>
     </w:p>
     <w:p>
@@ -226,7 +226,7 @@
           <w:color w:val="1E40AF"/>
           <w:sz w:val="20"/>
         </w:rPr>
-        <w:t>📚 1-Chorak: Prompt Engineering, AI Dizayn va Kiberxavfsizlik (9 hafta, 43 soat)</w:t>
+        <w:t>📚 1-Chorak: Prompt Engineering, AI Dizayn va Kiberxavfsizlik (11 hafta, 51 soat)</w:t>
       </w:r>
     </w:p>
     <w:tbl>
@@ -3384,7 +3384,7 @@
                 <w:b/>
                 <w:sz w:val="15"/>
               </w:rPr>
-              <w:t>4-h/15</w:t>
+              <w:t>4-h/17</w:t>
             </w:r>
           </w:p>
         </w:tc>
@@ -3451,7 +3451,7 @@
                 <w:rFonts w:ascii="Arial" w:hAnsi="Arial"/>
                 <w:sz w:val="15"/>
               </w:rPr>
-              <w:t>Matematik AI Lab</w:t>
+              <w:t>Amaliy</w:t>
             </w:r>
           </w:p>
         </w:tc>
@@ -3472,7 +3472,7 @@
                 <w:rFonts w:ascii="Arial" w:hAnsi="Arial"/>
                 <w:sz w:val="15"/>
               </w:rPr>
-              <w:t>Vektor embeddinglar, Yuqori o'lchovli fazo, Kosinus o'xshashlik formulasi, Dot product</w:t>
+              <w:t>руки (Tool Calling). Но осталась серьёзная проблема: модель не знает ваших докум</w:t>
             </w:r>
           </w:p>
         </w:tc>
@@ -3493,7 +3493,7 @@
                 <w:rFonts w:ascii="Arial" w:hAnsi="Arial"/>
                 <w:sz w:val="15"/>
               </w:rPr>
-              <w:t>Kosinus burchagi orqali semantik yaqinlikni aniqlovchi qidiruv tizimi (Lab)</w:t>
+              <w:t>Amaliy ish varaqasi va kod</w:t>
             </w:r>
           </w:p>
         </w:tc>
@@ -3565,7 +3565,7 @@
                 <w:b/>
                 <w:sz w:val="15"/>
               </w:rPr>
-              <w:t>4-h/16</w:t>
+              <w:t>4-h/18</w:t>
             </w:r>
           </w:p>
         </w:tc>
@@ -3632,7 +3632,7 @@
                 <w:rFonts w:ascii="Arial" w:hAnsi="Arial"/>
                 <w:sz w:val="15"/>
               </w:rPr>
-              <w:t>Red Team Lab</w:t>
+              <w:t>Amaliy</w:t>
             </w:r>
           </w:p>
         </w:tc>
@@ -3653,7 +3653,7 @@
                 <w:rFonts w:ascii="Arial" w:hAnsi="Arial"/>
                 <w:sz w:val="15"/>
               </w:rPr>
-              <w:t>OWASP LLM01, Direct va Indirect Prompt Injection, Jailbreak turlari, Dual-LLM filtr</w:t>
+              <w:t>прямо в контекст модели . А на уроке 14 вы дали модели инструменты . Теперь вопр</w:t>
             </w:r>
           </w:p>
         </w:tc>
@@ -3674,7 +3674,7 @@
                 <w:rFonts w:ascii="Arial" w:hAnsi="Arial"/>
                 <w:sz w:val="15"/>
               </w:rPr>
-              <w:t>Xakerlik xurujlariga bardosh beruvchi ko'p qatlamli Guardrail himoya tizimi (Lab)</w:t>
+              <w:t>Amaliy ish varaqasi va kod</w:t>
             </w:r>
           </w:p>
         </w:tc>
@@ -3746,7 +3746,7 @@
                 <w:b/>
                 <w:sz w:val="15"/>
               </w:rPr>
-              <w:t>5-h/21</w:t>
+              <w:t>4-h/19</w:t>
             </w:r>
           </w:p>
         </w:tc>
@@ -3768,7 +3768,7 @@
                 <w:b/>
                 <w:sz w:val="15"/>
               </w:rPr>
-              <w:t>Kriptografiya Asoslari: AES-256, RSA va Maxfiy Aloqa</w:t>
+              <w:t>AI Agent Sandboxing va RCE Himoyasi: Xavfsiz Kod Bajarish</w:t>
             </w:r>
           </w:p>
         </w:tc>
@@ -3813,7 +3813,7 @@
                 <w:rFonts w:ascii="Arial" w:hAnsi="Arial"/>
                 <w:sz w:val="15"/>
               </w:rPr>
-              <w:t>Interaktiv Studio</w:t>
+              <w:t>Amaliy</w:t>
             </w:r>
           </w:p>
         </w:tc>
@@ -3834,7 +3834,7 @@
                 <w:rFonts w:ascii="Arial" w:hAnsi="Arial"/>
                 <w:sz w:val="15"/>
               </w:rPr>
-              <w:t>Simmetrik AES-256-GCM, Asimmetrik RSA-2048, SHA-256 xesh, Bit Tamper hujumi</w:t>
+              <w:t>инструменты (Tool Calling) и исследовали атаки Prompt Injection. Но что происход</w:t>
             </w:r>
           </w:p>
         </w:tc>
@@ -3855,7 +3855,7 @@
                 <w:rFonts w:ascii="Arial" w:hAnsi="Arial"/>
                 <w:sz w:val="15"/>
               </w:rPr>
-              <w:t>Crypto Studio da shifrlangan xabarlar, kalitlar juftligi va tamper tekshiruvi (Studio)</w:t>
+              <w:t>Amaliy ish varaqasi va kod</w:t>
             </w:r>
           </w:p>
         </w:tc>
@@ -3876,7 +3876,7 @@
                 <w:rFonts w:ascii="Arial" w:hAnsi="Arial"/>
                 <w:sz w:val="15"/>
               </w:rPr>
-              <w:t>Interaktiv Studio</w:t>
+              <w:t>Interaktiv Lab</w:t>
             </w:r>
           </w:p>
         </w:tc>
@@ -3927,7 +3927,7 @@
                 <w:b/>
                 <w:sz w:val="15"/>
               </w:rPr>
-              <w:t>5-h/22</w:t>
+              <w:t>4-h/20</w:t>
             </w:r>
           </w:p>
         </w:tc>
@@ -3949,7 +3949,7 @@
                 <w:b/>
                 <w:sz w:val="15"/>
               </w:rPr>
-              <w:t>Zero Trust va IAM Arxitekturasi</w:t>
+              <w:t>Multi-Agent Tizimlari Xavfsizligi, Egress Nazorati va Demo Day</w:t>
             </w:r>
           </w:p>
         </w:tc>
@@ -3994,7 +3994,7 @@
                 <w:rFonts w:ascii="Arial" w:hAnsi="Arial"/>
                 <w:sz w:val="15"/>
               </w:rPr>
-              <w:t>Enterprise Architecture</w:t>
+              <w:t>Amaliy</w:t>
             </w:r>
           </w:p>
         </w:tc>
@@ -4015,7 +4015,7 @@
                 <w:rFonts w:ascii="Arial" w:hAnsi="Arial"/>
                 <w:sz w:val="15"/>
               </w:rPr>
-              <w:t>NIST SP 800-207, Verify Explicitly, Least Privilege, Assume Breach, RBAC vs ABAC, mTLS</w:t>
+              <w:t>мультиагентные границы доверия (Trust Boundaries) , фильтруем утечки через Egres</w:t>
             </w:r>
           </w:p>
         </w:tc>
@@ -4036,7 +4036,7 @@
                 <w:rFonts w:ascii="Arial" w:hAnsi="Arial"/>
                 <w:sz w:val="15"/>
               </w:rPr>
-              <w:t>Least-Privilege tamoyiliga mos korporativ IAM JSON siyosati va Capital One tahlili</w:t>
+              <w:t>Amaliy ish varaqasi va kod</w:t>
             </w:r>
           </w:p>
         </w:tc>
@@ -4057,7 +4057,7 @@
                 <w:rFonts w:ascii="Arial" w:hAnsi="Arial"/>
                 <w:sz w:val="15"/>
               </w:rPr>
-              <w:t>Interaktiv Studio</w:t>
+              <w:t>Interaktiv Lab</w:t>
             </w:r>
           </w:p>
         </w:tc>
@@ -4108,7 +4108,7 @@
                 <w:b/>
                 <w:sz w:val="15"/>
               </w:rPr>
-              <w:t>5-h/23</w:t>
+              <w:t>5-h/21</w:t>
             </w:r>
           </w:p>
         </w:tc>
@@ -4130,7 +4130,7 @@
                 <w:b/>
                 <w:sz w:val="15"/>
               </w:rPr>
-              <w:t>API Xavfsizligi va Rate Limiting: Token Bucket, DDoS va HMAC</w:t>
+              <w:t>Kriptografiya Asoslari: AES-256, RSA va Maxfiy Aloqa</w:t>
             </w:r>
           </w:p>
         </w:tc>
@@ -4175,7 +4175,7 @@
                 <w:rFonts w:ascii="Arial" w:hAnsi="Arial"/>
                 <w:sz w:val="15"/>
               </w:rPr>
-              <w:t>Kiberxavfsizlik</w:t>
+              <w:t>Interaktiv Studio</w:t>
             </w:r>
           </w:p>
         </w:tc>
@@ -4196,7 +4196,7 @@
                 <w:rFonts w:ascii="Arial" w:hAnsi="Arial"/>
                 <w:sz w:val="15"/>
               </w:rPr>
-              <w:t>OWASP API Top 10, Token Bucket va Leaky Bucket algoritmlari, DDoS mudofaasi, HMAC imzo</w:t>
+              <w:t>Simmetrik AES-256-GCM, Asimmetrik RSA-2048, SHA-256 xesh, Bit Tamper hujumi</w:t>
             </w:r>
           </w:p>
         </w:tc>
@@ -4217,7 +4217,7 @@
                 <w:rFonts w:ascii="Arial" w:hAnsi="Arial"/>
                 <w:sz w:val="15"/>
               </w:rPr>
-              <w:t>API cheklovchi va soxtalashtirilgan so'rovlarni aniqlovchi HMAC middleware</w:t>
+              <w:t>Crypto Studio da shifrlangan xabarlar, kalitlar juftligi va tamper tekshiruvi (Studio)</w:t>
             </w:r>
           </w:p>
         </w:tc>
@@ -4289,7 +4289,7 @@
                 <w:b/>
                 <w:sz w:val="15"/>
               </w:rPr>
-              <w:t>5-h/24</w:t>
+              <w:t>5-h/22</w:t>
             </w:r>
           </w:p>
         </w:tc>
@@ -4311,7 +4311,7 @@
                 <w:b/>
                 <w:sz w:val="15"/>
               </w:rPr>
-              <w:t>AI Model Xavfsizligi: Adversarial Hujumlar va Red Teaming</w:t>
+              <w:t>Zero Trust va IAM Arxitekturasi</w:t>
             </w:r>
           </w:p>
         </w:tc>
@@ -4356,7 +4356,7 @@
                 <w:rFonts w:ascii="Arial" w:hAnsi="Arial"/>
                 <w:sz w:val="15"/>
               </w:rPr>
-              <w:t>AI Xavfsizlik</w:t>
+              <w:t>Enterprise Architecture</w:t>
             </w:r>
           </w:p>
         </w:tc>
@@ -4377,7 +4377,7 @@
                 <w:rFonts w:ascii="Arial" w:hAnsi="Arial"/>
                 <w:sz w:val="15"/>
               </w:rPr>
-              <w:t>MITRE ATLAS, Adversarial Perturbation, FGSM gradient hujumi, Data Poisoning, Red Teaming</w:t>
+              <w:t>NIST SP 800-207, Verify Explicitly, Least Privilege, Assume Breach, RBAC vs ABAC, mTLS</w:t>
             </w:r>
           </w:p>
         </w:tc>
@@ -4398,7 +4398,7 @@
                 <w:rFonts w:ascii="Arial" w:hAnsi="Arial"/>
                 <w:sz w:val="15"/>
               </w:rPr>
-              <w:t>Ko'rinmas shovqinli kiber-hujumlar va zaharli o'quv ma'lumotlarini aniqlash protokoli</w:t>
+              <w:t>Least-Privilege tamoyiliga mos korporativ IAM JSON siyosati va Capital One tahlili</w:t>
             </w:r>
           </w:p>
         </w:tc>
@@ -4470,7 +4470,7 @@
                 <w:b/>
                 <w:sz w:val="15"/>
               </w:rPr>
-              <w:t>5-h/25</w:t>
+              <w:t>5-h/23</w:t>
             </w:r>
           </w:p>
         </w:tc>
@@ -4492,7 +4492,7 @@
                 <w:b/>
                 <w:sz w:val="15"/>
               </w:rPr>
-              <w:t>SOC Simulyatsiyasi va Kiber-Insident Boshqaruvi</w:t>
+              <w:t>API Xavfsizligi va Rate Limiting: Token Bucket, DDoS va HMAC</w:t>
             </w:r>
           </w:p>
         </w:tc>
@@ -4537,7 +4537,7 @@
                 <w:rFonts w:ascii="Arial" w:hAnsi="Arial"/>
                 <w:sz w:val="15"/>
               </w:rPr>
-              <w:t>Kiber-Insident</w:t>
+              <w:t>Kiberxavfsizlik</w:t>
             </w:r>
           </w:p>
         </w:tc>
@@ -4558,7 +4558,7 @@
                 <w:rFonts w:ascii="Arial" w:hAnsi="Arial"/>
                 <w:sz w:val="15"/>
               </w:rPr>
-              <w:t>SOC (Security Operations Center) 24/7, SIEM/SOAR, Sigma qoidalari, NIST SP 800-61, MTTR</w:t>
+              <w:t>OWASP API Top 10, Token Bucket va Leaky Bucket algoritmlari, DDoS mudofaasi, HMAC imzo</w:t>
             </w:r>
           </w:p>
         </w:tc>
@@ -4579,7 +4579,1454 @@
                 <w:rFonts w:ascii="Arial" w:hAnsi="Arial"/>
                 <w:sz w:val="15"/>
               </w:rPr>
+              <w:t>API cheklovchi va soxtalashtirilgan so'rovlarni aniqlovchi HMAC middleware</w:t>
+            </w:r>
+          </w:p>
+        </w:tc>
+        <w:tc>
+          <w:tcPr>
+            <w:tcW w:type="dxa" w:w="1584"/>
+            <w:shd w:fill="F8FAFC"/>
+            <w:tcMar>
+              <w:top w:w="60" w:type="dxa"/>
+              <w:bottom w:w="60" w:type="dxa"/>
+              <w:left w:w="80" w:type="dxa"/>
+              <w:right w:w="80" w:type="dxa"/>
+            </w:tcMar>
+          </w:tcPr>
+          <w:p>
+            <w:r>
+              <w:rPr>
+                <w:rFonts w:ascii="Arial" w:hAnsi="Arial"/>
+                <w:sz w:val="15"/>
+              </w:rPr>
+              <w:t>Interaktiv Studio</w:t>
+            </w:r>
+          </w:p>
+        </w:tc>
+        <w:tc>
+          <w:tcPr>
+            <w:tcW w:type="dxa" w:w="792"/>
+            <w:shd w:fill="F8FAFC"/>
+            <w:tcMar>
+              <w:top w:w="60" w:type="dxa"/>
+              <w:bottom w:w="60" w:type="dxa"/>
+              <w:left w:w="80" w:type="dxa"/>
+              <w:right w:w="80" w:type="dxa"/>
+            </w:tcMar>
+          </w:tcPr>
+          <w:p>
+            <w:pPr>
+              <w:jc w:val="center"/>
+            </w:pPr>
+            <w:r>
+              <w:rPr>
+                <w:rFonts w:ascii="Arial" w:hAnsi="Arial"/>
+                <w:sz w:val="15"/>
+              </w:rPr>
+              <w:t>___/___</w:t>
+            </w:r>
+          </w:p>
+        </w:tc>
+      </w:tr>
+      <w:tr>
+        <w:tc>
+          <w:tcPr>
+            <w:tcW w:type="dxa" w:w="1008"/>
+            <w:shd w:fill="FFFFFF"/>
+            <w:tcMar>
+              <w:top w:w="60" w:type="dxa"/>
+              <w:bottom w:w="60" w:type="dxa"/>
+              <w:left w:w="80" w:type="dxa"/>
+              <w:right w:w="80" w:type="dxa"/>
+            </w:tcMar>
+          </w:tcPr>
+          <w:p>
+            <w:pPr>
+              <w:jc w:val="center"/>
+            </w:pPr>
+            <w:r>
+              <w:rPr>
+                <w:rFonts w:ascii="Arial" w:hAnsi="Arial"/>
+                <w:b/>
+                <w:sz w:val="15"/>
+              </w:rPr>
+              <w:t>5-h/24</w:t>
+            </w:r>
+          </w:p>
+        </w:tc>
+        <w:tc>
+          <w:tcPr>
+            <w:tcW w:type="dxa" w:w="3312"/>
+            <w:shd w:fill="FFFFFF"/>
+            <w:tcMar>
+              <w:top w:w="60" w:type="dxa"/>
+              <w:bottom w:w="60" w:type="dxa"/>
+              <w:left w:w="80" w:type="dxa"/>
+              <w:right w:w="80" w:type="dxa"/>
+            </w:tcMar>
+          </w:tcPr>
+          <w:p>
+            <w:r>
+              <w:rPr>
+                <w:rFonts w:ascii="Arial" w:hAnsi="Arial"/>
+                <w:b/>
+                <w:sz w:val="15"/>
+              </w:rPr>
+              <w:t>AI Model Xavfsizligi: Adversarial Hujumlar va Red Teaming</w:t>
+            </w:r>
+          </w:p>
+        </w:tc>
+        <w:tc>
+          <w:tcPr>
+            <w:tcW w:type="dxa" w:w="648"/>
+            <w:shd w:fill="FFFFFF"/>
+            <w:tcMar>
+              <w:top w:w="60" w:type="dxa"/>
+              <w:bottom w:w="60" w:type="dxa"/>
+              <w:left w:w="80" w:type="dxa"/>
+              <w:right w:w="80" w:type="dxa"/>
+            </w:tcMar>
+          </w:tcPr>
+          <w:p>
+            <w:pPr>
+              <w:jc w:val="center"/>
+            </w:pPr>
+            <w:r>
+              <w:rPr>
+                <w:rFonts w:ascii="Arial" w:hAnsi="Arial"/>
+                <w:sz w:val="15"/>
+              </w:rPr>
+              <w:t>1</w:t>
+            </w:r>
+          </w:p>
+        </w:tc>
+        <w:tc>
+          <w:tcPr>
+            <w:tcW w:type="dxa" w:w="1584"/>
+            <w:shd w:fill="FFFFFF"/>
+            <w:tcMar>
+              <w:top w:w="60" w:type="dxa"/>
+              <w:bottom w:w="60" w:type="dxa"/>
+              <w:left w:w="80" w:type="dxa"/>
+              <w:right w:w="80" w:type="dxa"/>
+            </w:tcMar>
+          </w:tcPr>
+          <w:p>
+            <w:r>
+              <w:rPr>
+                <w:rFonts w:ascii="Arial" w:hAnsi="Arial"/>
+                <w:sz w:val="15"/>
+              </w:rPr>
+              <w:t>AI Xavfsizlik</w:t>
+            </w:r>
+          </w:p>
+        </w:tc>
+        <w:tc>
+          <w:tcPr>
+            <w:tcW w:type="dxa" w:w="3888"/>
+            <w:shd w:fill="FFFFFF"/>
+            <w:tcMar>
+              <w:top w:w="60" w:type="dxa"/>
+              <w:bottom w:w="60" w:type="dxa"/>
+              <w:left w:w="80" w:type="dxa"/>
+              <w:right w:w="80" w:type="dxa"/>
+            </w:tcMar>
+          </w:tcPr>
+          <w:p>
+            <w:r>
+              <w:rPr>
+                <w:rFonts w:ascii="Arial" w:hAnsi="Arial"/>
+                <w:sz w:val="15"/>
+              </w:rPr>
+              <w:t>MITRE ATLAS, Adversarial Perturbation, FGSM gradient hujumi, Data Poisoning, Red Teaming</w:t>
+            </w:r>
+          </w:p>
+        </w:tc>
+        <w:tc>
+          <w:tcPr>
+            <w:tcW w:type="dxa" w:w="2592"/>
+            <w:shd w:fill="FFFFFF"/>
+            <w:tcMar>
+              <w:top w:w="60" w:type="dxa"/>
+              <w:bottom w:w="60" w:type="dxa"/>
+              <w:left w:w="80" w:type="dxa"/>
+              <w:right w:w="80" w:type="dxa"/>
+            </w:tcMar>
+          </w:tcPr>
+          <w:p>
+            <w:r>
+              <w:rPr>
+                <w:rFonts w:ascii="Arial" w:hAnsi="Arial"/>
+                <w:sz w:val="15"/>
+              </w:rPr>
+              <w:t>Ko'rinmas shovqinli kiber-hujumlar va zaharli o'quv ma'lumotlarini aniqlash protokoli</w:t>
+            </w:r>
+          </w:p>
+        </w:tc>
+        <w:tc>
+          <w:tcPr>
+            <w:tcW w:type="dxa" w:w="1584"/>
+            <w:shd w:fill="FFFFFF"/>
+            <w:tcMar>
+              <w:top w:w="60" w:type="dxa"/>
+              <w:bottom w:w="60" w:type="dxa"/>
+              <w:left w:w="80" w:type="dxa"/>
+              <w:right w:w="80" w:type="dxa"/>
+            </w:tcMar>
+          </w:tcPr>
+          <w:p>
+            <w:r>
+              <w:rPr>
+                <w:rFonts w:ascii="Arial" w:hAnsi="Arial"/>
+                <w:sz w:val="15"/>
+              </w:rPr>
+              <w:t>Interaktiv Studio</w:t>
+            </w:r>
+          </w:p>
+        </w:tc>
+        <w:tc>
+          <w:tcPr>
+            <w:tcW w:type="dxa" w:w="792"/>
+            <w:shd w:fill="FFFFFF"/>
+            <w:tcMar>
+              <w:top w:w="60" w:type="dxa"/>
+              <w:bottom w:w="60" w:type="dxa"/>
+              <w:left w:w="80" w:type="dxa"/>
+              <w:right w:w="80" w:type="dxa"/>
+            </w:tcMar>
+          </w:tcPr>
+          <w:p>
+            <w:pPr>
+              <w:jc w:val="center"/>
+            </w:pPr>
+            <w:r>
+              <w:rPr>
+                <w:rFonts w:ascii="Arial" w:hAnsi="Arial"/>
+                <w:sz w:val="15"/>
+              </w:rPr>
+              <w:t>___/___</w:t>
+            </w:r>
+          </w:p>
+        </w:tc>
+      </w:tr>
+      <w:tr>
+        <w:tc>
+          <w:tcPr>
+            <w:tcW w:type="dxa" w:w="1008"/>
+            <w:shd w:fill="F8FAFC"/>
+            <w:tcMar>
+              <w:top w:w="60" w:type="dxa"/>
+              <w:bottom w:w="60" w:type="dxa"/>
+              <w:left w:w="80" w:type="dxa"/>
+              <w:right w:w="80" w:type="dxa"/>
+            </w:tcMar>
+          </w:tcPr>
+          <w:p>
+            <w:pPr>
+              <w:jc w:val="center"/>
+            </w:pPr>
+            <w:r>
+              <w:rPr>
+                <w:rFonts w:ascii="Arial" w:hAnsi="Arial"/>
+                <w:b/>
+                <w:sz w:val="15"/>
+              </w:rPr>
+              <w:t>5-h/25</w:t>
+            </w:r>
+          </w:p>
+        </w:tc>
+        <w:tc>
+          <w:tcPr>
+            <w:tcW w:type="dxa" w:w="3312"/>
+            <w:shd w:fill="F8FAFC"/>
+            <w:tcMar>
+              <w:top w:w="60" w:type="dxa"/>
+              <w:bottom w:w="60" w:type="dxa"/>
+              <w:left w:w="80" w:type="dxa"/>
+              <w:right w:w="80" w:type="dxa"/>
+            </w:tcMar>
+          </w:tcPr>
+          <w:p>
+            <w:r>
+              <w:rPr>
+                <w:rFonts w:ascii="Arial" w:hAnsi="Arial"/>
+                <w:b/>
+                <w:sz w:val="15"/>
+              </w:rPr>
+              <w:t>SOC Simulyatsiyasi va Kiber-Insident Boshqaruvi</w:t>
+            </w:r>
+          </w:p>
+        </w:tc>
+        <w:tc>
+          <w:tcPr>
+            <w:tcW w:type="dxa" w:w="648"/>
+            <w:shd w:fill="F8FAFC"/>
+            <w:tcMar>
+              <w:top w:w="60" w:type="dxa"/>
+              <w:bottom w:w="60" w:type="dxa"/>
+              <w:left w:w="80" w:type="dxa"/>
+              <w:right w:w="80" w:type="dxa"/>
+            </w:tcMar>
+          </w:tcPr>
+          <w:p>
+            <w:pPr>
+              <w:jc w:val="center"/>
+            </w:pPr>
+            <w:r>
+              <w:rPr>
+                <w:rFonts w:ascii="Arial" w:hAnsi="Arial"/>
+                <w:sz w:val="15"/>
+              </w:rPr>
+              <w:t>1</w:t>
+            </w:r>
+          </w:p>
+        </w:tc>
+        <w:tc>
+          <w:tcPr>
+            <w:tcW w:type="dxa" w:w="1584"/>
+            <w:shd w:fill="F8FAFC"/>
+            <w:tcMar>
+              <w:top w:w="60" w:type="dxa"/>
+              <w:bottom w:w="60" w:type="dxa"/>
+              <w:left w:w="80" w:type="dxa"/>
+              <w:right w:w="80" w:type="dxa"/>
+            </w:tcMar>
+          </w:tcPr>
+          <w:p>
+            <w:r>
+              <w:rPr>
+                <w:rFonts w:ascii="Arial" w:hAnsi="Arial"/>
+                <w:sz w:val="15"/>
+              </w:rPr>
+              <w:t>Kiber-Insident</w:t>
+            </w:r>
+          </w:p>
+        </w:tc>
+        <w:tc>
+          <w:tcPr>
+            <w:tcW w:type="dxa" w:w="3888"/>
+            <w:shd w:fill="F8FAFC"/>
+            <w:tcMar>
+              <w:top w:w="60" w:type="dxa"/>
+              <w:bottom w:w="60" w:type="dxa"/>
+              <w:left w:w="80" w:type="dxa"/>
+              <w:right w:w="80" w:type="dxa"/>
+            </w:tcMar>
+          </w:tcPr>
+          <w:p>
+            <w:r>
+              <w:rPr>
+                <w:rFonts w:ascii="Arial" w:hAnsi="Arial"/>
+                <w:sz w:val="15"/>
+              </w:rPr>
+              <w:t>SOC (Security Operations Center) 24/7, SIEM/SOAR, Sigma qoidalari, NIST SP 800-61, MTTR</w:t>
+            </w:r>
+          </w:p>
+        </w:tc>
+        <w:tc>
+          <w:tcPr>
+            <w:tcW w:type="dxa" w:w="2592"/>
+            <w:shd w:fill="F8FAFC"/>
+            <w:tcMar>
+              <w:top w:w="60" w:type="dxa"/>
+              <w:bottom w:w="60" w:type="dxa"/>
+              <w:left w:w="80" w:type="dxa"/>
+              <w:right w:w="80" w:type="dxa"/>
+            </w:tcMar>
+          </w:tcPr>
+          <w:p>
+            <w:r>
+              <w:rPr>
+                <w:rFonts w:ascii="Arial" w:hAnsi="Arial"/>
+                <w:sz w:val="15"/>
+              </w:rPr>
               <w:t>Sigma aniqlash qoidasi va xakerlik hujumidan keyingi rasmiy Post-Mortem hisoboti</w:t>
+            </w:r>
+          </w:p>
+        </w:tc>
+        <w:tc>
+          <w:tcPr>
+            <w:tcW w:type="dxa" w:w="1584"/>
+            <w:shd w:fill="F8FAFC"/>
+            <w:tcMar>
+              <w:top w:w="60" w:type="dxa"/>
+              <w:bottom w:w="60" w:type="dxa"/>
+              <w:left w:w="80" w:type="dxa"/>
+              <w:right w:w="80" w:type="dxa"/>
+            </w:tcMar>
+          </w:tcPr>
+          <w:p>
+            <w:r>
+              <w:rPr>
+                <w:rFonts w:ascii="Arial" w:hAnsi="Arial"/>
+                <w:sz w:val="15"/>
+              </w:rPr>
+              <w:t>Interaktiv Studio</w:t>
+            </w:r>
+          </w:p>
+        </w:tc>
+        <w:tc>
+          <w:tcPr>
+            <w:tcW w:type="dxa" w:w="792"/>
+            <w:shd w:fill="F8FAFC"/>
+            <w:tcMar>
+              <w:top w:w="60" w:type="dxa"/>
+              <w:bottom w:w="60" w:type="dxa"/>
+              <w:left w:w="80" w:type="dxa"/>
+              <w:right w:w="80" w:type="dxa"/>
+            </w:tcMar>
+          </w:tcPr>
+          <w:p>
+            <w:pPr>
+              <w:jc w:val="center"/>
+            </w:pPr>
+            <w:r>
+              <w:rPr>
+                <w:rFonts w:ascii="Arial" w:hAnsi="Arial"/>
+                <w:sz w:val="15"/>
+              </w:rPr>
+              <w:t>___/___</w:t>
+            </w:r>
+          </w:p>
+        </w:tc>
+      </w:tr>
+      <w:tr>
+        <w:tc>
+          <w:tcPr>
+            <w:tcW w:type="dxa" w:w="1008"/>
+            <w:shd w:fill="FFFFFF"/>
+            <w:tcMar>
+              <w:top w:w="60" w:type="dxa"/>
+              <w:bottom w:w="60" w:type="dxa"/>
+              <w:left w:w="80" w:type="dxa"/>
+              <w:right w:w="80" w:type="dxa"/>
+            </w:tcMar>
+          </w:tcPr>
+          <w:p>
+            <w:pPr>
+              <w:jc w:val="center"/>
+            </w:pPr>
+            <w:r>
+              <w:rPr>
+                <w:rFonts w:ascii="Arial" w:hAnsi="Arial"/>
+                <w:b/>
+                <w:sz w:val="15"/>
+              </w:rPr>
+              <w:t>6-h/26</w:t>
+            </w:r>
+          </w:p>
+        </w:tc>
+        <w:tc>
+          <w:tcPr>
+            <w:tcW w:type="dxa" w:w="3312"/>
+            <w:shd w:fill="FFFFFF"/>
+            <w:tcMar>
+              <w:top w:w="60" w:type="dxa"/>
+              <w:bottom w:w="60" w:type="dxa"/>
+              <w:left w:w="80" w:type="dxa"/>
+              <w:right w:w="80" w:type="dxa"/>
+            </w:tcMar>
+          </w:tcPr>
+          <w:p>
+            <w:r>
+              <w:rPr>
+                <w:rFonts w:ascii="Arial" w:hAnsi="Arial"/>
+                <w:b/>
+                <w:sz w:val="15"/>
+              </w:rPr>
+              <w:t>Cloud Arxitekturasi va Umumiy Mas'uliyat Modeli</w:t>
+            </w:r>
+          </w:p>
+        </w:tc>
+        <w:tc>
+          <w:tcPr>
+            <w:tcW w:type="dxa" w:w="648"/>
+            <w:shd w:fill="FFFFFF"/>
+            <w:tcMar>
+              <w:top w:w="60" w:type="dxa"/>
+              <w:bottom w:w="60" w:type="dxa"/>
+              <w:left w:w="80" w:type="dxa"/>
+              <w:right w:w="80" w:type="dxa"/>
+            </w:tcMar>
+          </w:tcPr>
+          <w:p>
+            <w:pPr>
+              <w:jc w:val="center"/>
+            </w:pPr>
+            <w:r>
+              <w:rPr>
+                <w:rFonts w:ascii="Arial" w:hAnsi="Arial"/>
+                <w:sz w:val="15"/>
+              </w:rPr>
+              <w:t>1</w:t>
+            </w:r>
+          </w:p>
+        </w:tc>
+        <w:tc>
+          <w:tcPr>
+            <w:tcW w:type="dxa" w:w="1584"/>
+            <w:shd w:fill="FFFFFF"/>
+            <w:tcMar>
+              <w:top w:w="60" w:type="dxa"/>
+              <w:bottom w:w="60" w:type="dxa"/>
+              <w:left w:w="80" w:type="dxa"/>
+              <w:right w:w="80" w:type="dxa"/>
+            </w:tcMar>
+          </w:tcPr>
+          <w:p>
+            <w:r>
+              <w:rPr>
+                <w:rFonts w:ascii="Arial" w:hAnsi="Arial"/>
+                <w:sz w:val="15"/>
+              </w:rPr>
+              <w:t>Amaliy</w:t>
+            </w:r>
+          </w:p>
+        </w:tc>
+        <w:tc>
+          <w:tcPr>
+            <w:tcW w:type="dxa" w:w="3888"/>
+            <w:shd w:fill="FFFFFF"/>
+            <w:tcMar>
+              <w:top w:w="60" w:type="dxa"/>
+              <w:bottom w:w="60" w:type="dxa"/>
+              <w:left w:w="80" w:type="dxa"/>
+              <w:right w:w="80" w:type="dxa"/>
+            </w:tcMar>
+          </w:tcPr>
+          <w:p>
+            <w:r>
+              <w:rPr>
+                <w:rFonts w:ascii="Arial" w:hAnsi="Arial"/>
+                <w:sz w:val="15"/>
+              </w:rPr>
+              <w:t>Nega serverlarni AWS, GCP va Azure ga ko'chirish kiber-xurujlardan avtomatik him</w:t>
+            </w:r>
+          </w:p>
+        </w:tc>
+        <w:tc>
+          <w:tcPr>
+            <w:tcW w:type="dxa" w:w="2592"/>
+            <w:shd w:fill="FFFFFF"/>
+            <w:tcMar>
+              <w:top w:w="60" w:type="dxa"/>
+              <w:bottom w:w="60" w:type="dxa"/>
+              <w:left w:w="80" w:type="dxa"/>
+              <w:right w:w="80" w:type="dxa"/>
+            </w:tcMar>
+          </w:tcPr>
+          <w:p>
+            <w:r>
+              <w:rPr>
+                <w:rFonts w:ascii="Arial" w:hAnsi="Arial"/>
+                <w:sz w:val="15"/>
+              </w:rPr>
+              <w:t>Amaliy ish varaqasi va kod</w:t>
+            </w:r>
+          </w:p>
+        </w:tc>
+        <w:tc>
+          <w:tcPr>
+            <w:tcW w:type="dxa" w:w="1584"/>
+            <w:shd w:fill="FFFFFF"/>
+            <w:tcMar>
+              <w:top w:w="60" w:type="dxa"/>
+              <w:bottom w:w="60" w:type="dxa"/>
+              <w:left w:w="80" w:type="dxa"/>
+              <w:right w:w="80" w:type="dxa"/>
+            </w:tcMar>
+          </w:tcPr>
+          <w:p>
+            <w:r>
+              <w:rPr>
+                <w:rFonts w:ascii="Arial" w:hAnsi="Arial"/>
+                <w:sz w:val="15"/>
+              </w:rPr>
+              <w:t>VS Code / Brauzer</w:t>
+            </w:r>
+          </w:p>
+        </w:tc>
+        <w:tc>
+          <w:tcPr>
+            <w:tcW w:type="dxa" w:w="792"/>
+            <w:shd w:fill="FFFFFF"/>
+            <w:tcMar>
+              <w:top w:w="60" w:type="dxa"/>
+              <w:bottom w:w="60" w:type="dxa"/>
+              <w:left w:w="80" w:type="dxa"/>
+              <w:right w:w="80" w:type="dxa"/>
+            </w:tcMar>
+          </w:tcPr>
+          <w:p>
+            <w:pPr>
+              <w:jc w:val="center"/>
+            </w:pPr>
+            <w:r>
+              <w:rPr>
+                <w:rFonts w:ascii="Arial" w:hAnsi="Arial"/>
+                <w:sz w:val="15"/>
+              </w:rPr>
+              <w:t>___/___</w:t>
+            </w:r>
+          </w:p>
+        </w:tc>
+      </w:tr>
+      <w:tr>
+        <w:tc>
+          <w:tcPr>
+            <w:tcW w:type="dxa" w:w="1008"/>
+            <w:shd w:fill="F8FAFC"/>
+            <w:tcMar>
+              <w:top w:w="60" w:type="dxa"/>
+              <w:bottom w:w="60" w:type="dxa"/>
+              <w:left w:w="80" w:type="dxa"/>
+              <w:right w:w="80" w:type="dxa"/>
+            </w:tcMar>
+          </w:tcPr>
+          <w:p>
+            <w:pPr>
+              <w:jc w:val="center"/>
+            </w:pPr>
+            <w:r>
+              <w:rPr>
+                <w:rFonts w:ascii="Arial" w:hAnsi="Arial"/>
+                <w:b/>
+                <w:sz w:val="15"/>
+              </w:rPr>
+              <w:t>6-h/27</w:t>
+            </w:r>
+          </w:p>
+        </w:tc>
+        <w:tc>
+          <w:tcPr>
+            <w:tcW w:type="dxa" w:w="3312"/>
+            <w:shd w:fill="F8FAFC"/>
+            <w:tcMar>
+              <w:top w:w="60" w:type="dxa"/>
+              <w:bottom w:w="60" w:type="dxa"/>
+              <w:left w:w="80" w:type="dxa"/>
+              <w:right w:w="80" w:type="dxa"/>
+            </w:tcMar>
+          </w:tcPr>
+          <w:p>
+            <w:r>
+              <w:rPr>
+                <w:rFonts w:ascii="Arial" w:hAnsi="Arial"/>
+                <w:b/>
+                <w:sz w:val="15"/>
+              </w:rPr>
+              <w:t>Ochiq S3 Chelaklar va Cloud Storage Zaifliklari</w:t>
+            </w:r>
+          </w:p>
+        </w:tc>
+        <w:tc>
+          <w:tcPr>
+            <w:tcW w:type="dxa" w:w="648"/>
+            <w:shd w:fill="F8FAFC"/>
+            <w:tcMar>
+              <w:top w:w="60" w:type="dxa"/>
+              <w:bottom w:w="60" w:type="dxa"/>
+              <w:left w:w="80" w:type="dxa"/>
+              <w:right w:w="80" w:type="dxa"/>
+            </w:tcMar>
+          </w:tcPr>
+          <w:p>
+            <w:pPr>
+              <w:jc w:val="center"/>
+            </w:pPr>
+            <w:r>
+              <w:rPr>
+                <w:rFonts w:ascii="Arial" w:hAnsi="Arial"/>
+                <w:sz w:val="15"/>
+              </w:rPr>
+              <w:t>1</w:t>
+            </w:r>
+          </w:p>
+        </w:tc>
+        <w:tc>
+          <w:tcPr>
+            <w:tcW w:type="dxa" w:w="1584"/>
+            <w:shd w:fill="F8FAFC"/>
+            <w:tcMar>
+              <w:top w:w="60" w:type="dxa"/>
+              <w:bottom w:w="60" w:type="dxa"/>
+              <w:left w:w="80" w:type="dxa"/>
+              <w:right w:w="80" w:type="dxa"/>
+            </w:tcMar>
+          </w:tcPr>
+          <w:p>
+            <w:r>
+              <w:rPr>
+                <w:rFonts w:ascii="Arial" w:hAnsi="Arial"/>
+                <w:sz w:val="15"/>
+              </w:rPr>
+              <w:t>Amaliy</w:t>
+            </w:r>
+          </w:p>
+        </w:tc>
+        <w:tc>
+          <w:tcPr>
+            <w:tcW w:type="dxa" w:w="3888"/>
+            <w:shd w:fill="F8FAFC"/>
+            <w:tcMar>
+              <w:top w:w="60" w:type="dxa"/>
+              <w:bottom w:w="60" w:type="dxa"/>
+              <w:left w:w="80" w:type="dxa"/>
+              <w:right w:w="80" w:type="dxa"/>
+            </w:tcMar>
+          </w:tcPr>
+          <w:p>
+            <w:r>
+              <w:rPr>
+                <w:rFonts w:ascii="Arial" w:hAnsi="Arial"/>
+                <w:sz w:val="15"/>
+              </w:rPr>
+              <w:t>Nega bitta `"Principal": "*"` qatori yuzlab gigabayt ma'lumotlar bazalari va pas</w:t>
+            </w:r>
+          </w:p>
+        </w:tc>
+        <w:tc>
+          <w:tcPr>
+            <w:tcW w:type="dxa" w:w="2592"/>
+            <w:shd w:fill="F8FAFC"/>
+            <w:tcMar>
+              <w:top w:w="60" w:type="dxa"/>
+              <w:bottom w:w="60" w:type="dxa"/>
+              <w:left w:w="80" w:type="dxa"/>
+              <w:right w:w="80" w:type="dxa"/>
+            </w:tcMar>
+          </w:tcPr>
+          <w:p>
+            <w:r>
+              <w:rPr>
+                <w:rFonts w:ascii="Arial" w:hAnsi="Arial"/>
+                <w:sz w:val="15"/>
+              </w:rPr>
+              <w:t>Amaliy ish varaqasi va kod</w:t>
+            </w:r>
+          </w:p>
+        </w:tc>
+        <w:tc>
+          <w:tcPr>
+            <w:tcW w:type="dxa" w:w="1584"/>
+            <w:shd w:fill="F8FAFC"/>
+            <w:tcMar>
+              <w:top w:w="60" w:type="dxa"/>
+              <w:bottom w:w="60" w:type="dxa"/>
+              <w:left w:w="80" w:type="dxa"/>
+              <w:right w:w="80" w:type="dxa"/>
+            </w:tcMar>
+          </w:tcPr>
+          <w:p>
+            <w:r>
+              <w:rPr>
+                <w:rFonts w:ascii="Arial" w:hAnsi="Arial"/>
+                <w:sz w:val="15"/>
+              </w:rPr>
+              <w:t>Interaktiv Studio</w:t>
+            </w:r>
+          </w:p>
+        </w:tc>
+        <w:tc>
+          <w:tcPr>
+            <w:tcW w:type="dxa" w:w="792"/>
+            <w:shd w:fill="F8FAFC"/>
+            <w:tcMar>
+              <w:top w:w="60" w:type="dxa"/>
+              <w:bottom w:w="60" w:type="dxa"/>
+              <w:left w:w="80" w:type="dxa"/>
+              <w:right w:w="80" w:type="dxa"/>
+            </w:tcMar>
+          </w:tcPr>
+          <w:p>
+            <w:pPr>
+              <w:jc w:val="center"/>
+            </w:pPr>
+            <w:r>
+              <w:rPr>
+                <w:rFonts w:ascii="Arial" w:hAnsi="Arial"/>
+                <w:sz w:val="15"/>
+              </w:rPr>
+              <w:t>___/___</w:t>
+            </w:r>
+          </w:p>
+        </w:tc>
+      </w:tr>
+      <w:tr>
+        <w:tc>
+          <w:tcPr>
+            <w:tcW w:type="dxa" w:w="1008"/>
+            <w:shd w:fill="FFFFFF"/>
+            <w:tcMar>
+              <w:top w:w="60" w:type="dxa"/>
+              <w:bottom w:w="60" w:type="dxa"/>
+              <w:left w:w="80" w:type="dxa"/>
+              <w:right w:w="80" w:type="dxa"/>
+            </w:tcMar>
+          </w:tcPr>
+          <w:p>
+            <w:pPr>
+              <w:jc w:val="center"/>
+            </w:pPr>
+            <w:r>
+              <w:rPr>
+                <w:rFonts w:ascii="Arial" w:hAnsi="Arial"/>
+                <w:b/>
+                <w:sz w:val="15"/>
+              </w:rPr>
+              <w:t>6-h/28</w:t>
+            </w:r>
+          </w:p>
+        </w:tc>
+        <w:tc>
+          <w:tcPr>
+            <w:tcW w:type="dxa" w:w="3312"/>
+            <w:shd w:fill="FFFFFF"/>
+            <w:tcMar>
+              <w:top w:w="60" w:type="dxa"/>
+              <w:bottom w:w="60" w:type="dxa"/>
+              <w:left w:w="80" w:type="dxa"/>
+              <w:right w:w="80" w:type="dxa"/>
+            </w:tcMar>
+          </w:tcPr>
+          <w:p>
+            <w:r>
+              <w:rPr>
+                <w:rFonts w:ascii="Arial" w:hAnsi="Arial"/>
+                <w:b/>
+                <w:sz w:val="15"/>
+              </w:rPr>
+              <w:t>Infratuzilma Kod Sifatida (IaC) va Terraform Xavfsizligi</w:t>
+            </w:r>
+          </w:p>
+        </w:tc>
+        <w:tc>
+          <w:tcPr>
+            <w:tcW w:type="dxa" w:w="648"/>
+            <w:shd w:fill="FFFFFF"/>
+            <w:tcMar>
+              <w:top w:w="60" w:type="dxa"/>
+              <w:bottom w:w="60" w:type="dxa"/>
+              <w:left w:w="80" w:type="dxa"/>
+              <w:right w:w="80" w:type="dxa"/>
+            </w:tcMar>
+          </w:tcPr>
+          <w:p>
+            <w:pPr>
+              <w:jc w:val="center"/>
+            </w:pPr>
+            <w:r>
+              <w:rPr>
+                <w:rFonts w:ascii="Arial" w:hAnsi="Arial"/>
+                <w:sz w:val="15"/>
+              </w:rPr>
+              <w:t>1</w:t>
+            </w:r>
+          </w:p>
+        </w:tc>
+        <w:tc>
+          <w:tcPr>
+            <w:tcW w:type="dxa" w:w="1584"/>
+            <w:shd w:fill="FFFFFF"/>
+            <w:tcMar>
+              <w:top w:w="60" w:type="dxa"/>
+              <w:bottom w:w="60" w:type="dxa"/>
+              <w:left w:w="80" w:type="dxa"/>
+              <w:right w:w="80" w:type="dxa"/>
+            </w:tcMar>
+          </w:tcPr>
+          <w:p>
+            <w:r>
+              <w:rPr>
+                <w:rFonts w:ascii="Arial" w:hAnsi="Arial"/>
+                <w:sz w:val="15"/>
+              </w:rPr>
+              <w:t>Amaliy</w:t>
+            </w:r>
+          </w:p>
+        </w:tc>
+        <w:tc>
+          <w:tcPr>
+            <w:tcW w:type="dxa" w:w="3888"/>
+            <w:shd w:fill="FFFFFF"/>
+            <w:tcMar>
+              <w:top w:w="60" w:type="dxa"/>
+              <w:bottom w:w="60" w:type="dxa"/>
+              <w:left w:w="80" w:type="dxa"/>
+              <w:right w:w="80" w:type="dxa"/>
+            </w:tcMar>
+          </w:tcPr>
+          <w:p>
+            <w:r>
+              <w:rPr>
+                <w:rFonts w:ascii="Arial" w:hAnsi="Arial"/>
+                <w:sz w:val="15"/>
+              </w:rPr>
+              <w:t xml:space="preserve">Nega qo'lda boshqariladigan ClickOps o'rnini deklarativ HCL kodi egalladi, ammo </w:t>
+            </w:r>
+          </w:p>
+        </w:tc>
+        <w:tc>
+          <w:tcPr>
+            <w:tcW w:type="dxa" w:w="2592"/>
+            <w:shd w:fill="FFFFFF"/>
+            <w:tcMar>
+              <w:top w:w="60" w:type="dxa"/>
+              <w:bottom w:w="60" w:type="dxa"/>
+              <w:left w:w="80" w:type="dxa"/>
+              <w:right w:w="80" w:type="dxa"/>
+            </w:tcMar>
+          </w:tcPr>
+          <w:p>
+            <w:r>
+              <w:rPr>
+                <w:rFonts w:ascii="Arial" w:hAnsi="Arial"/>
+                <w:sz w:val="15"/>
+              </w:rPr>
+              <w:t>Amaliy ish varaqasi va kod</w:t>
+            </w:r>
+          </w:p>
+        </w:tc>
+        <w:tc>
+          <w:tcPr>
+            <w:tcW w:type="dxa" w:w="1584"/>
+            <w:shd w:fill="FFFFFF"/>
+            <w:tcMar>
+              <w:top w:w="60" w:type="dxa"/>
+              <w:bottom w:w="60" w:type="dxa"/>
+              <w:left w:w="80" w:type="dxa"/>
+              <w:right w:w="80" w:type="dxa"/>
+            </w:tcMar>
+          </w:tcPr>
+          <w:p>
+            <w:r>
+              <w:rPr>
+                <w:rFonts w:ascii="Arial" w:hAnsi="Arial"/>
+                <w:sz w:val="15"/>
+              </w:rPr>
+              <w:t>Interaktiv Studio</w:t>
+            </w:r>
+          </w:p>
+        </w:tc>
+        <w:tc>
+          <w:tcPr>
+            <w:tcW w:type="dxa" w:w="792"/>
+            <w:shd w:fill="FFFFFF"/>
+            <w:tcMar>
+              <w:top w:w="60" w:type="dxa"/>
+              <w:bottom w:w="60" w:type="dxa"/>
+              <w:left w:w="80" w:type="dxa"/>
+              <w:right w:w="80" w:type="dxa"/>
+            </w:tcMar>
+          </w:tcPr>
+          <w:p>
+            <w:pPr>
+              <w:jc w:val="center"/>
+            </w:pPr>
+            <w:r>
+              <w:rPr>
+                <w:rFonts w:ascii="Arial" w:hAnsi="Arial"/>
+                <w:sz w:val="15"/>
+              </w:rPr>
+              <w:t>___/___</w:t>
+            </w:r>
+          </w:p>
+        </w:tc>
+      </w:tr>
+      <w:tr>
+        <w:tc>
+          <w:tcPr>
+            <w:tcW w:type="dxa" w:w="1008"/>
+            <w:shd w:fill="F8FAFC"/>
+            <w:tcMar>
+              <w:top w:w="60" w:type="dxa"/>
+              <w:bottom w:w="60" w:type="dxa"/>
+              <w:left w:w="80" w:type="dxa"/>
+              <w:right w:w="80" w:type="dxa"/>
+            </w:tcMar>
+          </w:tcPr>
+          <w:p>
+            <w:pPr>
+              <w:jc w:val="center"/>
+            </w:pPr>
+            <w:r>
+              <w:rPr>
+                <w:rFonts w:ascii="Arial" w:hAnsi="Arial"/>
+                <w:b/>
+                <w:sz w:val="15"/>
+              </w:rPr>
+              <w:t>6-h/29</w:t>
+            </w:r>
+          </w:p>
+        </w:tc>
+        <w:tc>
+          <w:tcPr>
+            <w:tcW w:type="dxa" w:w="3312"/>
+            <w:shd w:fill="F8FAFC"/>
+            <w:tcMar>
+              <w:top w:w="60" w:type="dxa"/>
+              <w:bottom w:w="60" w:type="dxa"/>
+              <w:left w:w="80" w:type="dxa"/>
+              <w:right w:w="80" w:type="dxa"/>
+            </w:tcMar>
+          </w:tcPr>
+          <w:p>
+            <w:r>
+              <w:rPr>
+                <w:rFonts w:ascii="Arial" w:hAnsi="Arial"/>
+                <w:b/>
+                <w:sz w:val="15"/>
+              </w:rPr>
+              <w:t>HashiCorp Vault va Maxfiy Kalitlar Boshqaruvi: Dinamik Sirlar va TTL</w:t>
+            </w:r>
+          </w:p>
+        </w:tc>
+        <w:tc>
+          <w:tcPr>
+            <w:tcW w:type="dxa" w:w="648"/>
+            <w:shd w:fill="F8FAFC"/>
+            <w:tcMar>
+              <w:top w:w="60" w:type="dxa"/>
+              <w:bottom w:w="60" w:type="dxa"/>
+              <w:left w:w="80" w:type="dxa"/>
+              <w:right w:w="80" w:type="dxa"/>
+            </w:tcMar>
+          </w:tcPr>
+          <w:p>
+            <w:pPr>
+              <w:jc w:val="center"/>
+            </w:pPr>
+            <w:r>
+              <w:rPr>
+                <w:rFonts w:ascii="Arial" w:hAnsi="Arial"/>
+                <w:sz w:val="15"/>
+              </w:rPr>
+              <w:t>1</w:t>
+            </w:r>
+          </w:p>
+        </w:tc>
+        <w:tc>
+          <w:tcPr>
+            <w:tcW w:type="dxa" w:w="1584"/>
+            <w:shd w:fill="F8FAFC"/>
+            <w:tcMar>
+              <w:top w:w="60" w:type="dxa"/>
+              <w:bottom w:w="60" w:type="dxa"/>
+              <w:left w:w="80" w:type="dxa"/>
+              <w:right w:w="80" w:type="dxa"/>
+            </w:tcMar>
+          </w:tcPr>
+          <w:p>
+            <w:r>
+              <w:rPr>
+                <w:rFonts w:ascii="Arial" w:hAnsi="Arial"/>
+                <w:sz w:val="15"/>
+              </w:rPr>
+              <w:t>Amaliy</w:t>
+            </w:r>
+          </w:p>
+        </w:tc>
+        <w:tc>
+          <w:tcPr>
+            <w:tcW w:type="dxa" w:w="3888"/>
+            <w:shd w:fill="F8FAFC"/>
+            <w:tcMar>
+              <w:top w:w="60" w:type="dxa"/>
+              <w:bottom w:w="60" w:type="dxa"/>
+              <w:left w:w="80" w:type="dxa"/>
+              <w:right w:w="80" w:type="dxa"/>
+            </w:tcMar>
+          </w:tcPr>
+          <w:p>
+            <w:r>
+              <w:rPr>
+                <w:rFonts w:ascii="Arial" w:hAnsi="Arial"/>
+                <w:sz w:val="15"/>
+              </w:rPr>
+              <w:t>Nega kod va `.env` fayllardagi statik parollar kiber-falokatga olib keladi? Secr</w:t>
+            </w:r>
+          </w:p>
+        </w:tc>
+        <w:tc>
+          <w:tcPr>
+            <w:tcW w:type="dxa" w:w="2592"/>
+            <w:shd w:fill="F8FAFC"/>
+            <w:tcMar>
+              <w:top w:w="60" w:type="dxa"/>
+              <w:bottom w:w="60" w:type="dxa"/>
+              <w:left w:w="80" w:type="dxa"/>
+              <w:right w:w="80" w:type="dxa"/>
+            </w:tcMar>
+          </w:tcPr>
+          <w:p>
+            <w:r>
+              <w:rPr>
+                <w:rFonts w:ascii="Arial" w:hAnsi="Arial"/>
+                <w:sz w:val="15"/>
+              </w:rPr>
+              <w:t>Amaliy ish varaqasi va kod</w:t>
+            </w:r>
+          </w:p>
+        </w:tc>
+        <w:tc>
+          <w:tcPr>
+            <w:tcW w:type="dxa" w:w="1584"/>
+            <w:shd w:fill="F8FAFC"/>
+            <w:tcMar>
+              <w:top w:w="60" w:type="dxa"/>
+              <w:bottom w:w="60" w:type="dxa"/>
+              <w:left w:w="80" w:type="dxa"/>
+              <w:right w:w="80" w:type="dxa"/>
+            </w:tcMar>
+          </w:tcPr>
+          <w:p>
+            <w:r>
+              <w:rPr>
+                <w:rFonts w:ascii="Arial" w:hAnsi="Arial"/>
+                <w:sz w:val="15"/>
+              </w:rPr>
+              <w:t>Interaktiv Studio</w:t>
+            </w:r>
+          </w:p>
+        </w:tc>
+        <w:tc>
+          <w:tcPr>
+            <w:tcW w:type="dxa" w:w="792"/>
+            <w:shd w:fill="F8FAFC"/>
+            <w:tcMar>
+              <w:top w:w="60" w:type="dxa"/>
+              <w:bottom w:w="60" w:type="dxa"/>
+              <w:left w:w="80" w:type="dxa"/>
+              <w:right w:w="80" w:type="dxa"/>
+            </w:tcMar>
+          </w:tcPr>
+          <w:p>
+            <w:pPr>
+              <w:jc w:val="center"/>
+            </w:pPr>
+            <w:r>
+              <w:rPr>
+                <w:rFonts w:ascii="Arial" w:hAnsi="Arial"/>
+                <w:sz w:val="15"/>
+              </w:rPr>
+              <w:t>___/___</w:t>
+            </w:r>
+          </w:p>
+        </w:tc>
+      </w:tr>
+      <w:tr>
+        <w:tc>
+          <w:tcPr>
+            <w:tcW w:type="dxa" w:w="1008"/>
+            <w:shd w:fill="FFFFFF"/>
+            <w:tcMar>
+              <w:top w:w="60" w:type="dxa"/>
+              <w:bottom w:w="60" w:type="dxa"/>
+              <w:left w:w="80" w:type="dxa"/>
+              <w:right w:w="80" w:type="dxa"/>
+            </w:tcMar>
+          </w:tcPr>
+          <w:p>
+            <w:pPr>
+              <w:jc w:val="center"/>
+            </w:pPr>
+            <w:r>
+              <w:rPr>
+                <w:rFonts w:ascii="Arial" w:hAnsi="Arial"/>
+                <w:b/>
+                <w:sz w:val="15"/>
+              </w:rPr>
+              <w:t>6-h/30</w:t>
+            </w:r>
+          </w:p>
+        </w:tc>
+        <w:tc>
+          <w:tcPr>
+            <w:tcW w:type="dxa" w:w="3312"/>
+            <w:shd w:fill="FFFFFF"/>
+            <w:tcMar>
+              <w:top w:w="60" w:type="dxa"/>
+              <w:bottom w:w="60" w:type="dxa"/>
+              <w:left w:w="80" w:type="dxa"/>
+              <w:right w:w="80" w:type="dxa"/>
+            </w:tcMar>
+          </w:tcPr>
+          <w:p>
+            <w:r>
+              <w:rPr>
+                <w:rFonts w:ascii="Arial" w:hAnsi="Arial"/>
+                <w:b/>
+                <w:sz w:val="15"/>
+              </w:rPr>
+              <w:t>DevSecOps Quvuri va Cloud Audit Demo Day</w:t>
+            </w:r>
+          </w:p>
+        </w:tc>
+        <w:tc>
+          <w:tcPr>
+            <w:tcW w:type="dxa" w:w="648"/>
+            <w:shd w:fill="FFFFFF"/>
+            <w:tcMar>
+              <w:top w:w="60" w:type="dxa"/>
+              <w:bottom w:w="60" w:type="dxa"/>
+              <w:left w:w="80" w:type="dxa"/>
+              <w:right w:w="80" w:type="dxa"/>
+            </w:tcMar>
+          </w:tcPr>
+          <w:p>
+            <w:pPr>
+              <w:jc w:val="center"/>
+            </w:pPr>
+            <w:r>
+              <w:rPr>
+                <w:rFonts w:ascii="Arial" w:hAnsi="Arial"/>
+                <w:sz w:val="15"/>
+              </w:rPr>
+              <w:t>1</w:t>
+            </w:r>
+          </w:p>
+        </w:tc>
+        <w:tc>
+          <w:tcPr>
+            <w:tcW w:type="dxa" w:w="1584"/>
+            <w:shd w:fill="FFFFFF"/>
+            <w:tcMar>
+              <w:top w:w="60" w:type="dxa"/>
+              <w:bottom w:w="60" w:type="dxa"/>
+              <w:left w:w="80" w:type="dxa"/>
+              <w:right w:w="80" w:type="dxa"/>
+            </w:tcMar>
+          </w:tcPr>
+          <w:p>
+            <w:r>
+              <w:rPr>
+                <w:rFonts w:ascii="Arial" w:hAnsi="Arial"/>
+                <w:sz w:val="15"/>
+              </w:rPr>
+              <w:t>Amaliy</w:t>
+            </w:r>
+          </w:p>
+        </w:tc>
+        <w:tc>
+          <w:tcPr>
+            <w:tcW w:type="dxa" w:w="3888"/>
+            <w:shd w:fill="FFFFFF"/>
+            <w:tcMar>
+              <w:top w:w="60" w:type="dxa"/>
+              <w:bottom w:w="60" w:type="dxa"/>
+              <w:left w:w="80" w:type="dxa"/>
+              <w:right w:w="80" w:type="dxa"/>
+            </w:tcMar>
+          </w:tcPr>
+          <w:p>
+            <w:r>
+              <w:rPr>
+                <w:rFonts w:ascii="Arial" w:hAnsi="Arial"/>
+                <w:sz w:val="15"/>
+              </w:rPr>
+              <w:t>Qanday qilib kiberxavfsizlikni rivojlanish to'sig'idan avtomatlashgan himoya qal</w:t>
+            </w:r>
+          </w:p>
+        </w:tc>
+        <w:tc>
+          <w:tcPr>
+            <w:tcW w:type="dxa" w:w="2592"/>
+            <w:shd w:fill="FFFFFF"/>
+            <w:tcMar>
+              <w:top w:w="60" w:type="dxa"/>
+              <w:bottom w:w="60" w:type="dxa"/>
+              <w:left w:w="80" w:type="dxa"/>
+              <w:right w:w="80" w:type="dxa"/>
+            </w:tcMar>
+          </w:tcPr>
+          <w:p>
+            <w:r>
+              <w:rPr>
+                <w:rFonts w:ascii="Arial" w:hAnsi="Arial"/>
+                <w:sz w:val="15"/>
+              </w:rPr>
+              <w:t>Amaliy ish varaqasi va kod</w:t>
+            </w:r>
+          </w:p>
+        </w:tc>
+        <w:tc>
+          <w:tcPr>
+            <w:tcW w:type="dxa" w:w="1584"/>
+            <w:shd w:fill="FFFFFF"/>
+            <w:tcMar>
+              <w:top w:w="60" w:type="dxa"/>
+              <w:bottom w:w="60" w:type="dxa"/>
+              <w:left w:w="80" w:type="dxa"/>
+              <w:right w:w="80" w:type="dxa"/>
+            </w:tcMar>
+          </w:tcPr>
+          <w:p>
+            <w:r>
+              <w:rPr>
+                <w:rFonts w:ascii="Arial" w:hAnsi="Arial"/>
+                <w:sz w:val="15"/>
+              </w:rPr>
+              <w:t>Interaktiv Studio</w:t>
+            </w:r>
+          </w:p>
+        </w:tc>
+        <w:tc>
+          <w:tcPr>
+            <w:tcW w:type="dxa" w:w="792"/>
+            <w:shd w:fill="FFFFFF"/>
+            <w:tcMar>
+              <w:top w:w="60" w:type="dxa"/>
+              <w:bottom w:w="60" w:type="dxa"/>
+              <w:left w:w="80" w:type="dxa"/>
+              <w:right w:w="80" w:type="dxa"/>
+            </w:tcMar>
+          </w:tcPr>
+          <w:p>
+            <w:pPr>
+              <w:jc w:val="center"/>
+            </w:pPr>
+            <w:r>
+              <w:rPr>
+                <w:rFonts w:ascii="Arial" w:hAnsi="Arial"/>
+                <w:sz w:val="15"/>
+              </w:rPr>
+              <w:t>___/___</w:t>
+            </w:r>
+          </w:p>
+        </w:tc>
+      </w:tr>
+      <w:tr>
+        <w:tc>
+          <w:tcPr>
+            <w:tcW w:type="dxa" w:w="1008"/>
+            <w:shd w:fill="F8FAFC"/>
+            <w:tcMar>
+              <w:top w:w="60" w:type="dxa"/>
+              <w:bottom w:w="60" w:type="dxa"/>
+              <w:left w:w="80" w:type="dxa"/>
+              <w:right w:w="80" w:type="dxa"/>
+            </w:tcMar>
+          </w:tcPr>
+          <w:p>
+            <w:pPr>
+              <w:jc w:val="center"/>
+            </w:pPr>
+            <w:r>
+              <w:rPr>
+                <w:rFonts w:ascii="Arial" w:hAnsi="Arial"/>
+                <w:b/>
+                <w:sz w:val="15"/>
+              </w:rPr>
+              <w:t>7-h/31</w:t>
+            </w:r>
+          </w:p>
+        </w:tc>
+        <w:tc>
+          <w:tcPr>
+            <w:tcW w:type="dxa" w:w="3312"/>
+            <w:shd w:fill="F8FAFC"/>
+            <w:tcMar>
+              <w:top w:w="60" w:type="dxa"/>
+              <w:bottom w:w="60" w:type="dxa"/>
+              <w:left w:w="80" w:type="dxa"/>
+              <w:right w:w="80" w:type="dxa"/>
+            </w:tcMar>
+          </w:tcPr>
+          <w:p>
+            <w:r>
+              <w:rPr>
+                <w:rFonts w:ascii="Arial" w:hAnsi="Arial"/>
+                <w:b/>
+                <w:sz w:val="15"/>
+              </w:rPr>
+              <w:t>Penetration Testing &amp; Ethical Hacking: O'z Zaiflik Skaneringni Dasturlash</w:t>
+            </w:r>
+          </w:p>
+        </w:tc>
+        <w:tc>
+          <w:tcPr>
+            <w:tcW w:type="dxa" w:w="648"/>
+            <w:shd w:fill="F8FAFC"/>
+            <w:tcMar>
+              <w:top w:w="60" w:type="dxa"/>
+              <w:bottom w:w="60" w:type="dxa"/>
+              <w:left w:w="80" w:type="dxa"/>
+              <w:right w:w="80" w:type="dxa"/>
+            </w:tcMar>
+          </w:tcPr>
+          <w:p>
+            <w:pPr>
+              <w:jc w:val="center"/>
+            </w:pPr>
+            <w:r>
+              <w:rPr>
+                <w:rFonts w:ascii="Arial" w:hAnsi="Arial"/>
+                <w:sz w:val="15"/>
+              </w:rPr>
+              <w:t>1</w:t>
+            </w:r>
+          </w:p>
+        </w:tc>
+        <w:tc>
+          <w:tcPr>
+            <w:tcW w:type="dxa" w:w="1584"/>
+            <w:shd w:fill="F8FAFC"/>
+            <w:tcMar>
+              <w:top w:w="60" w:type="dxa"/>
+              <w:bottom w:w="60" w:type="dxa"/>
+              <w:left w:w="80" w:type="dxa"/>
+              <w:right w:w="80" w:type="dxa"/>
+            </w:tcMar>
+          </w:tcPr>
+          <w:p>
+            <w:r>
+              <w:rPr>
+                <w:rFonts w:ascii="Arial" w:hAnsi="Arial"/>
+                <w:sz w:val="15"/>
+              </w:rPr>
+              <w:t>Amaliy</w:t>
+            </w:r>
+          </w:p>
+        </w:tc>
+        <w:tc>
+          <w:tcPr>
+            <w:tcW w:type="dxa" w:w="3888"/>
+            <w:shd w:fill="F8FAFC"/>
+            <w:tcMar>
+              <w:top w:w="60" w:type="dxa"/>
+              <w:bottom w:w="60" w:type="dxa"/>
+              <w:left w:w="80" w:type="dxa"/>
+              <w:right w:w="80" w:type="dxa"/>
+            </w:tcMar>
+          </w:tcPr>
+          <w:p>
+            <w:r>
+              <w:rPr>
+                <w:rFonts w:ascii="Arial" w:hAnsi="Arial"/>
+                <w:sz w:val="15"/>
+              </w:rPr>
+            </w:r>
+          </w:p>
+        </w:tc>
+        <w:tc>
+          <w:tcPr>
+            <w:tcW w:type="dxa" w:w="2592"/>
+            <w:shd w:fill="F8FAFC"/>
+            <w:tcMar>
+              <w:top w:w="60" w:type="dxa"/>
+              <w:bottom w:w="60" w:type="dxa"/>
+              <w:left w:w="80" w:type="dxa"/>
+              <w:right w:w="80" w:type="dxa"/>
+            </w:tcMar>
+          </w:tcPr>
+          <w:p>
+            <w:r>
+              <w:rPr>
+                <w:rFonts w:ascii="Arial" w:hAnsi="Arial"/>
+                <w:sz w:val="15"/>
+              </w:rPr>
+              <w:t>Amaliy ish varaqasi va kod</w:t>
             </w:r>
           </w:p>
         </w:tc>

</xml_diff>